<commit_message>
Correcciones BD II y Arquitectura + iconos
Co-Authored-By: Claude Opus 5 <noreply@anthropic.com>
</commit_message>
<xml_diff>
--- a/Arquitectura de Sistemas Computacionales/Clases/Clase 1 - Introduccion a arquitecturas cloud/Taller Clase 1 — Ficha y boceto CloudLite App.docx
+++ b/Arquitectura de Sistemas Computacionales/Clases/Clase 1 - Introduccion a arquitecturas cloud/Taller Clase 1 — Ficha y boceto CloudLite App.docx
@@ -176,7 +176,7 @@
           <w:color w:val="2B2B2B"/>
           <w:sz w:val="22"/>
         </w:rPr>
-        <w:t>Ficha PI: dominio, capacidades, actores y boceto C4 Context (Excalidraw/draw.io)</w:t>
+        <w:t>Ficha PI de 6 bloques + C4 Context en Mermaid renderizado en ExamLab (boceto previo en Excalidraw/draw.io)</w:t>
       </w:r>
     </w:p>
     <w:p>
@@ -237,6 +237,75 @@
           <w:sz w:val="22"/>
         </w:rPr>
         <w:t>Plantilla ficha: DOMINIO · PROBLEMA · CAPACIDADES · ACTORES · SISTEMAS EXTERNOS · FUERA DE ALCANCE.</w:t>
+      </w:r>
+    </w:p>
+    <w:p>
+      <w:pPr>
+        <w:pStyle w:val="ListBullet"/>
+        <w:spacing w:after="40"/>
+      </w:pPr>
+      <w:r>
+        <w:rPr>
+          <w:rFonts w:ascii="Calibri" w:hAnsi="Calibri" w:eastAsia="Calibri"/>
+          <w:b w:val="0"/>
+          <w:color w:val="2B2B2B"/>
+          <w:sz w:val="22"/>
+        </w:rPr>
+        <w:t xml:space="preserve">Diagrama: boceto visual en </w:t>
+      </w:r>
+      <w:r>
+        <w:rPr>
+          <w:rFonts w:ascii="Calibri" w:hAnsi="Calibri" w:eastAsia="Calibri"/>
+          <w:b/>
+          <w:color w:val="2B2B2B"/>
+          <w:sz w:val="22"/>
+        </w:rPr>
+        <w:t>Excalidraw o draw.io</w:t>
+      </w:r>
+      <w:r>
+        <w:rPr>
+          <w:rFonts w:ascii="Calibri" w:hAnsi="Calibri" w:eastAsia="Calibri"/>
+          <w:b w:val="0"/>
+          <w:color w:val="2B2B2B"/>
+          <w:sz w:val="22"/>
+        </w:rPr>
+        <w:t xml:space="preserve"> → conversión a </w:t>
+      </w:r>
+      <w:r>
+        <w:rPr>
+          <w:rFonts w:ascii="Calibri" w:hAnsi="Calibri" w:eastAsia="Calibri"/>
+          <w:b/>
+          <w:color w:val="2B2B2B"/>
+          <w:sz w:val="22"/>
+        </w:rPr>
+        <w:t>Mermaid (C4Context)</w:t>
+      </w:r>
+      <w:r>
+        <w:rPr>
+          <w:rFonts w:ascii="Calibri" w:hAnsi="Calibri" w:eastAsia="Calibri"/>
+          <w:b w:val="0"/>
+          <w:color w:val="2B2B2B"/>
+          <w:sz w:val="22"/>
+        </w:rPr>
+        <w:t xml:space="preserve"> con ayuda de una IA → pegar y </w:t>
+      </w:r>
+      <w:r>
+        <w:rPr>
+          <w:rFonts w:ascii="Calibri" w:hAnsi="Calibri" w:eastAsia="Calibri"/>
+          <w:b/>
+          <w:color w:val="2B2B2B"/>
+          <w:sz w:val="22"/>
+        </w:rPr>
+        <w:t>renderizar en ExamLab</w:t>
+      </w:r>
+      <w:r>
+        <w:rPr>
+          <w:rFonts w:ascii="Calibri" w:hAnsi="Calibri" w:eastAsia="Calibri"/>
+          <w:b w:val="0"/>
+          <w:color w:val="2B2B2B"/>
+          <w:sz w:val="22"/>
+        </w:rPr>
+        <w:t>.</w:t>
       </w:r>
     </w:p>
     <w:p>
@@ -342,7 +411,7 @@
           <w:color w:val="2B2B2B"/>
           <w:sz w:val="22"/>
         </w:rPr>
-        <w:t>Paso 3: escriba en la pregunta de tipo diagrama de ExamLab el C4 Context en Mermaid con exactamente 1 System para CloudLite, 2 Person, 2 System_Ext y 5 relaciones etiquetadas con verbo de negocio y protocolo, verificando al renderizar dentro de la plataforma que no aparezca ninguna caja interna (ni base de datos ni API ni worker, eso es Clase 4) y que cada flecha se lea en voz alta como una frase completa.</w:t>
+        <w:t>Paso 3: dibuje primero el boceto del C4 Context en Excalidraw o draw.io, que es donde se piensa el modelo, y despues pidale a una IA que lo traduzca a Mermaid («convierte este diagrama a Mermaid usando C4Context»); pegue ese codigo en la pregunta de tipo diagrama de ExamLab y verifique que renderice ahi mismo, con exactamente 1 System para CloudLite, 2 Person, 2 System_Ext y 5 relaciones etiquetadas con verbo de negocio y protocolo, verificando en el diagrama ya renderizado que no aparezca ninguna caja interna (ni base de datos ni API ni worker, eso es Clase 4) y que cada flecha se lea en voz alta como una frase completa.</w:t>
       </w:r>
     </w:p>
     <w:p>
@@ -493,6 +562,21 @@
           <w:sz w:val="22"/>
         </w:rPr>
         <w:t>☐ ¿Los 2-3 sistemas externos coinciden con los System_Ext del diagrama C4?</w:t>
+      </w:r>
+    </w:p>
+    <w:p>
+      <w:pPr>
+        <w:pStyle w:val="ListBullet"/>
+        <w:spacing w:after="40"/>
+      </w:pPr>
+      <w:r>
+        <w:rPr>
+          <w:rFonts w:ascii="Calibri" w:hAnsi="Calibri" w:eastAsia="Calibri"/>
+          <w:b w:val="0"/>
+          <w:color w:val="2B2B2B"/>
+          <w:sz w:val="22"/>
+        </w:rPr>
+        <w:t>☐ ¿El diagrama quedó pegado como Mermaid y renderizado en ExamLab (no solo como imagen)?</w:t>
       </w:r>
     </w:p>
     <w:p>
@@ -668,7 +752,7 @@
           <w:color w:val="2B2B2B"/>
           <w:sz w:val="22"/>
         </w:rPr>
-        <w:t>El diagrama se escribe como texto en sintaxis Mermaid y la plataforma lo dibuja al instante. No hay que exportar imagenes ni salir a otra herramienta.</w:t>
+        <w:t>El diagrama se escribe como texto en sintaxis Mermaid y la plataforma lo dibuja al instante: no se sube una imagen. Puedes disenarlo primero a mano en Excalidraw o draw.io y pedirle a una IA que lo traduzca a Mermaid (ver «Del boceto al codigo Mermaid» mas abajo).</w:t>
       </w:r>
     </w:p>
     <w:p>
@@ -774,6 +858,131 @@
           <w:sz w:val="22"/>
         </w:rPr>
         <w:t>Varias opciones, una sola correcta.</w:t>
+      </w:r>
+    </w:p>
+    <w:p>
+      <w:pPr>
+        <w:spacing w:after="120" w:before="0"/>
+        <w:jc w:val="left"/>
+      </w:pPr>
+      <w:r>
+        <w:rPr>
+          <w:rFonts w:ascii="Calibri" w:hAnsi="Calibri" w:eastAsia="Calibri"/>
+          <w:b/>
+          <w:color w:val="095292"/>
+          <w:sz w:val="22"/>
+        </w:rPr>
+        <w:t>Del boceto al codigo Mermaid</w:t>
+      </w:r>
+    </w:p>
+    <w:p>
+      <w:pPr>
+        <w:spacing w:after="120" w:before="0"/>
+        <w:jc w:val="left"/>
+      </w:pPr>
+      <w:r>
+        <w:rPr>
+          <w:rFonts w:ascii="Calibri" w:hAnsi="Calibri" w:eastAsia="Calibri"/>
+          <w:b w:val="0"/>
+          <w:color w:val="2B2B2B"/>
+          <w:sz w:val="22"/>
+        </w:rPr>
+        <w:t>La pregunta de diagrama NO recibe imagenes: se responde con codigo Mermaid (`C4Context`) que la plataforma dibuja al instante. No tienes que escribirlo de memoria; el camino corto es este:</w:t>
+      </w:r>
+    </w:p>
+    <w:p>
+      <w:r>
+        <w:rPr>
+          <w:rFonts w:ascii="Calibri" w:hAnsi="Calibri" w:eastAsia="Calibri"/>
+          <w:b/>
+          <w:color w:val="2B2B2B"/>
+          <w:sz w:val="22"/>
+        </w:rPr>
+        <w:t>1. Disena visual:</w:t>
+      </w:r>
+      <w:r>
+        <w:rPr>
+          <w:rFonts w:ascii="Calibri" w:hAnsi="Calibri" w:eastAsia="Calibri"/>
+          <w:b w:val="0"/>
+          <w:color w:val="2B2B2B"/>
+          <w:sz w:val="22"/>
+        </w:rPr>
+        <w:t xml:space="preserve"> Dibuja el diagrama como quieras en Excalidraw o draw.io: es mas rapido arrastrar cajas que escribir codigo, y ahi es donde piensas el modelo.</w:t>
+      </w:r>
+    </w:p>
+    <w:p>
+      <w:r>
+        <w:rPr>
+          <w:rFonts w:ascii="Calibri" w:hAnsi="Calibri" w:eastAsia="Calibri"/>
+          <w:b/>
+          <w:color w:val="2B2B2B"/>
+          <w:sz w:val="22"/>
+        </w:rPr>
+        <w:t>2. Traduce con IA:</w:t>
+      </w:r>
+      <w:r>
+        <w:rPr>
+          <w:rFonts w:ascii="Calibri" w:hAnsi="Calibri" w:eastAsia="Calibri"/>
+          <w:b w:val="0"/>
+          <w:color w:val="2B2B2B"/>
+          <w:sz w:val="22"/>
+        </w:rPr>
+        <w:t xml:space="preserve"> Copia o describe tu boceto a una IA y pidele el codigo Mermaid: «convierte este diagrama a Mermaid usando `C4Context`». Revisa el resultado: la IA acierta la sintaxis, no tu modelo.</w:t>
+      </w:r>
+    </w:p>
+    <w:p>
+      <w:r>
+        <w:rPr>
+          <w:rFonts w:ascii="Calibri" w:hAnsi="Calibri" w:eastAsia="Calibri"/>
+          <w:b/>
+          <w:color w:val="2B2B2B"/>
+          <w:sz w:val="22"/>
+        </w:rPr>
+        <w:t>3. Pega y renderiza en ExamLab:</w:t>
+      </w:r>
+      <w:r>
+        <w:rPr>
+          <w:rFonts w:ascii="Calibri" w:hAnsi="Calibri" w:eastAsia="Calibri"/>
+          <w:b w:val="0"/>
+          <w:color w:val="2B2B2B"/>
+          <w:sz w:val="22"/>
+        </w:rPr>
+        <w:t xml:space="preserve"> Pega ese codigo en la caja de texto de la pregunta y mira como lo dibuja la plataforma. Si no renderiza, corrige ahi mismo: lo que se califica es el diagrama renderizado dentro de ExamLab.</w:t>
+      </w:r>
+    </w:p>
+    <w:p>
+      <w:r>
+        <w:rPr>
+          <w:rFonts w:ascii="Calibri" w:hAnsi="Calibri" w:eastAsia="Calibri"/>
+          <w:b/>
+          <w:color w:val="2B2B2B"/>
+          <w:sz w:val="22"/>
+        </w:rPr>
+        <w:t>4. Guarda el PNG para tu PI:</w:t>
+      </w:r>
+      <w:r>
+        <w:rPr>
+          <w:rFonts w:ascii="Calibri" w:hAnsi="Calibri" w:eastAsia="Calibri"/>
+          <w:b w:val="0"/>
+          <w:color w:val="2B2B2B"/>
+          <w:sz w:val="22"/>
+        </w:rPr>
+        <w:t xml:space="preserve"> Exporta tambien la imagen a la carpeta de tu Proyecto Integrador. Esa copia es para tu informe; no reemplaza la respuesta en la plataforma.</w:t>
+      </w:r>
+    </w:p>
+    <w:p>
+      <w:pPr>
+        <w:spacing w:after="120" w:before="0"/>
+        <w:jc w:val="left"/>
+      </w:pPr>
+      <w:r>
+        <w:rPr>
+          <w:rFonts w:ascii="Calibri" w:hAnsi="Calibri" w:eastAsia="Calibri"/>
+          <w:b w:val="0"/>
+          <w:color w:val="2B2B2B"/>
+          <w:sz w:val="22"/>
+        </w:rPr>
+        <w:t>Si la IA te devuelve algo que no renderiza, no lo pegues tal cual: corrigelo en ExamLab hasta ver el dibujo. Un diagrama que no renderiza no se puede calificar.</w:t>
       </w:r>
     </w:p>
     <w:p>

</xml_diff>

<commit_message>
Solucion completa de ARQ Clase 1 y dudas frecuentes del estudiante
Co-Authored-By: Claude Opus 5 <noreply@anthropic.com>
</commit_message>
<xml_diff>
--- a/Arquitectura de Sistemas Computacionales/Clases/Clase 1 - Introduccion a arquitecturas cloud/Taller Clase 1 — Ficha y boceto CloudLite App.docx
+++ b/Arquitectura de Sistemas Computacionales/Clases/Clase 1 - Introduccion a arquitecturas cloud/Taller Clase 1 — Ficha y boceto CloudLite App.docx
@@ -636,7 +636,202 @@
           <w:color w:val="095292"/>
           <w:sz w:val="24"/>
         </w:rPr>
-        <w:t>9. Entrega</w:t>
+        <w:t>9. Dudas frecuentes (lee esto antes de preguntar)</w:t>
+      </w:r>
+    </w:p>
+    <w:p>
+      <w:pPr>
+        <w:spacing w:after="40" w:before="0"/>
+        <w:jc w:val="left"/>
+      </w:pPr>
+      <w:r>
+        <w:rPr>
+          <w:rFonts w:ascii="Calibri" w:hAnsi="Calibri" w:eastAsia="Calibri"/>
+          <w:b/>
+          <w:color w:val="2B2B2B"/>
+          <w:sz w:val="21"/>
+        </w:rPr>
+        <w:t>¿Tengo que escribir el diagrama a mano en Mermaid?</w:t>
+      </w:r>
+    </w:p>
+    <w:p>
+      <w:pPr>
+        <w:spacing w:after="120" w:before="0"/>
+        <w:jc w:val="left"/>
+      </w:pPr>
+      <w:r>
+        <w:rPr>
+          <w:rFonts w:ascii="Calibri" w:hAnsi="Calibri" w:eastAsia="Calibri"/>
+          <w:b w:val="0"/>
+          <w:color w:val="2B2B2B"/>
+          <w:sz w:val="21"/>
+        </w:rPr>
+        <w:t>No. Dibújalo en Excalidraw o draw.io y pide a una IA que lo traduzca a Mermaid; tú revisas el resultado y lo pegas en ExamLab. Lo que se califica es el diagrama renderizado en la plataforma, no la imagen.</w:t>
+      </w:r>
+    </w:p>
+    <w:p>
+      <w:pPr>
+        <w:spacing w:after="40" w:before="0"/>
+        <w:jc w:val="left"/>
+      </w:pPr>
+      <w:r>
+        <w:rPr>
+          <w:rFonts w:ascii="Calibri" w:hAnsi="Calibri" w:eastAsia="Calibri"/>
+          <w:b/>
+          <w:color w:val="2B2B2B"/>
+          <w:sz w:val="21"/>
+        </w:rPr>
+        <w:t>¿Por qué mi diagrama no puede llevar la base de datos?</w:t>
+      </w:r>
+    </w:p>
+    <w:p>
+      <w:pPr>
+        <w:spacing w:after="120" w:before="0"/>
+        <w:jc w:val="left"/>
+      </w:pPr>
+      <w:r>
+        <w:rPr>
+          <w:rFonts w:ascii="Calibri" w:hAnsi="Calibri" w:eastAsia="Calibri"/>
+          <w:b w:val="0"/>
+          <w:color w:val="2B2B2B"/>
+          <w:sz w:val="21"/>
+        </w:rPr>
+        <w:t>Porque hoy entregas el nivel Context, donde el sistema es una sola caja negra. La base de datos y la API aparecen en el nivel Container, que es el entregable de la Clase 4.</w:t>
+      </w:r>
+    </w:p>
+    <w:p>
+      <w:pPr>
+        <w:spacing w:after="40" w:before="0"/>
+        <w:jc w:val="left"/>
+      </w:pPr>
+      <w:r>
+        <w:rPr>
+          <w:rFonts w:ascii="Calibri" w:hAnsi="Calibri" w:eastAsia="Calibri"/>
+          <w:b/>
+          <w:color w:val="2B2B2B"/>
+          <w:sz w:val="21"/>
+        </w:rPr>
+        <w:t>¿Cuántas cajas debe tener el diagrama?</w:t>
+      </w:r>
+    </w:p>
+    <w:p>
+      <w:pPr>
+        <w:spacing w:after="120" w:before="0"/>
+        <w:jc w:val="left"/>
+      </w:pPr>
+      <w:r>
+        <w:rPr>
+          <w:rFonts w:ascii="Calibri" w:hAnsi="Calibri" w:eastAsia="Calibri"/>
+          <w:b w:val="0"/>
+          <w:color w:val="2B2B2B"/>
+          <w:sz w:val="21"/>
+        </w:rPr>
+        <w:t>Entre cuatro y ocho elementos en total. Si tienes veinte, es casi seguro que se colaron piezas internas del sistema.</w:t>
+      </w:r>
+    </w:p>
+    <w:p>
+      <w:pPr>
+        <w:spacing w:after="40" w:before="0"/>
+        <w:jc w:val="left"/>
+      </w:pPr>
+      <w:r>
+        <w:rPr>
+          <w:rFonts w:ascii="Calibri" w:hAnsi="Calibri" w:eastAsia="Calibri"/>
+          <w:b/>
+          <w:color w:val="2B2B2B"/>
+          <w:sz w:val="21"/>
+        </w:rPr>
+        <w:t>¿La respuesta correcta siempre es «nube»?</w:t>
+      </w:r>
+    </w:p>
+    <w:p>
+      <w:pPr>
+        <w:spacing w:after="120" w:before="0"/>
+        <w:jc w:val="left"/>
+      </w:pPr>
+      <w:r>
+        <w:rPr>
+          <w:rFonts w:ascii="Calibri" w:hAnsi="Calibri" w:eastAsia="Calibri"/>
+          <w:b w:val="0"/>
+          <w:color w:val="2B2B2B"/>
+          <w:sz w:val="21"/>
+        </w:rPr>
+        <w:t>No se califica la elección: se califican los 4 criterios aplicados a TU dominio y el riesgo que declaras asumir. Un veredicto por on-premise bien sustentado vale lo mismo. Lo que no vale es un veredicto sin riesgo.</w:t>
+      </w:r>
+    </w:p>
+    <w:p>
+      <w:pPr>
+        <w:spacing w:after="40" w:before="0"/>
+        <w:jc w:val="left"/>
+      </w:pPr>
+      <w:r>
+        <w:rPr>
+          <w:rFonts w:ascii="Calibri" w:hAnsi="Calibri" w:eastAsia="Calibri"/>
+          <w:b/>
+          <w:color w:val="2B2B2B"/>
+          <w:sz w:val="21"/>
+        </w:rPr>
+        <w:t>¿Tengo que abrir una cuenta en AWS o Azure?</w:t>
+      </w:r>
+    </w:p>
+    <w:p>
+      <w:pPr>
+        <w:spacing w:after="120" w:before="0"/>
+        <w:jc w:val="left"/>
+      </w:pPr>
+      <w:r>
+        <w:rPr>
+          <w:rFonts w:ascii="Calibri" w:hAnsi="Calibri" w:eastAsia="Calibri"/>
+          <w:b w:val="0"/>
+          <w:color w:val="2B2B2B"/>
+          <w:sz w:val="21"/>
+        </w:rPr>
+        <w:t>No, y ninguna actividad del curso lo va a pedir. Nada de tarjeta de crédito en todo el semestre.</w:t>
+      </w:r>
+    </w:p>
+    <w:p>
+      <w:pPr>
+        <w:spacing w:after="40" w:before="0"/>
+        <w:jc w:val="left"/>
+      </w:pPr>
+      <w:r>
+        <w:rPr>
+          <w:rFonts w:ascii="Calibri" w:hAnsi="Calibri" w:eastAsia="Calibri"/>
+          <w:b/>
+          <w:color w:val="2B2B2B"/>
+          <w:sz w:val="21"/>
+        </w:rPr>
+        <w:t>¿Puedo cambiar de dominio más adelante?</w:t>
+      </w:r>
+    </w:p>
+    <w:p>
+      <w:pPr>
+        <w:spacing w:after="120" w:before="0"/>
+        <w:jc w:val="left"/>
+      </w:pPr>
+      <w:r>
+        <w:rPr>
+          <w:rFonts w:ascii="Calibri" w:hAnsi="Calibri" w:eastAsia="Calibri"/>
+          <w:b w:val="0"/>
+          <w:color w:val="2B2B2B"/>
+          <w:sz w:val="21"/>
+        </w:rPr>
+        <w:t>No. El dominio se cierra hoy y las Clases 4, 7, 11 y 15 reutilizan estos mismos nombres. Si te queda grande, recorta el bloque «fuera de alcance».</w:t>
+      </w:r>
+    </w:p>
+    <w:p>
+      <w:pPr>
+        <w:spacing w:after="120" w:before="240"/>
+        <w:jc w:val="left"/>
+      </w:pPr>
+      <w:r>
+        <w:rPr>
+          <w:rFonts w:ascii="Calibri" w:hAnsi="Calibri" w:eastAsia="Calibri"/>
+          <w:b/>
+          <w:color w:val="095292"/>
+          <w:sz w:val="24"/>
+        </w:rPr>
+        <w:t>10. Entrega</w:t>
       </w:r>
     </w:p>
     <w:p>
@@ -682,7 +877,7 @@
           <w:color w:val="095292"/>
           <w:sz w:val="24"/>
         </w:rPr>
-        <w:t>10. Que vas a resolver en ExamLab</w:t>
+        <w:t>11. Que vas a resolver en ExamLab</w:t>
       </w:r>
     </w:p>
     <w:p>

</xml_diff>

<commit_message>
ARQ Clase 1 alineada con la actividad real del Corte 1
Co-Authored-By: Claude Opus 5 <noreply@anthropic.com>
</commit_message>
<xml_diff>
--- a/Arquitectura de Sistemas Computacionales/Clases/Clase 1 - Introduccion a arquitecturas cloud/Taller Clase 1 — Ficha y boceto CloudLite App.docx
+++ b/Arquitectura de Sistemas Computacionales/Clases/Clase 1 - Introduccion a arquitecturas cloud/Taller Clase 1 — Ficha y boceto CloudLite App.docx
@@ -176,7 +176,7 @@
           <w:color w:val="2B2B2B"/>
           <w:sz w:val="22"/>
         </w:rPr>
-        <w:t>Ficha PI de 6 bloques + C4 Context en Mermaid renderizado en ExamLab (boceto previo en Excalidraw/draw.io)</w:t>
+        <w:t>Ficha PI de 5 bloques + C4 Context en Mermaid renderizado en ExamLab (boceto previo en Excalidraw/draw.io)</w:t>
       </w:r>
     </w:p>
     <w:p>
@@ -236,7 +236,7 @@
           <w:color w:val="2B2B2B"/>
           <w:sz w:val="22"/>
         </w:rPr>
-        <w:t>Plantilla ficha: DOMINIO · PROBLEMA · CAPACIDADES · ACTORES · SISTEMAS EXTERNOS · FUERA DE ALCANCE.</w:t>
+        <w:t>Plantilla ficha (5 bloques): DOMINIO · PROBLEMA · ACTORES (con sus sistemas externos) · CAPACIDADES · FUERA DE ALCANCE.</w:t>
       </w:r>
     </w:p>
     <w:p>
@@ -381,7 +381,7 @@
           <w:color w:val="2B2B2B"/>
           <w:sz w:val="22"/>
         </w:rPr>
-        <w:t>Paso 1: elija un dominio concreto entre AgendaU, BiblioLite, InventarioLab, TurnosClinica o EventosCampus (o uno propio del mismo tamano) y escriba el problema en exactamente 3 frases: quien sufre el problema, como se resuelve hoy sin CloudLite y una cifra medible del dolor (por ejemplo 40 correos por semana para cuadrar 12 asesorias), verificando que en ninguna de las 3 frases aparezca una expresion generica como app de la universidad o red social; el resultado queda en la seccion 1 Dominio y problema del informe del PI.</w:t>
+        <w:t>Paso 1: elija un dominio concreto entre AgendaU, BiblioLite, InventarioLab, TurnosClinica o EventosCampus (o uno propio del mismo tamano) y escriba en la pregunta 1 el problema en 2 o 3 frases, diciendo QUIEN lo sufre con un rol concreto y COMO se mide con una cifra, aunque sea estimada; verifique que su enunciado no sirva igual para cualquier otro sistema, porque entonces el dominio todavia es generico.</w:t>
       </w:r>
     </w:p>
     <w:p>
@@ -396,7 +396,7 @@
           <w:color w:val="2B2B2B"/>
           <w:sz w:val="22"/>
         </w:rPr>
-        <w:t>Paso 2: liste exactamente 4 capacidades con la forma verbo mas objeto de negocio (reservar cita, publicar cupo, cancelar reserva, notificar recordatorio), 3 actores humanos con lo que espera cada uno, 2 o 3 sistemas externos con los que CloudLite intercambia informacion (por ejemplo proveedor de identidad, correo transaccional o pasarela de pagos) y 3 elementos de fuera de alcance, verificando que ninguna capacidad nombre tecnologia (nada de usar PostgreSQL ni desplegar en Docker) y que las 4 capacidades se lean como frases del negocio; queda en la seccion 1 del informe y se pega tal cual en la pregunta 1 de ExamLab.</w:t>
+        <w:t>Paso 2: complete en la pregunta 2 la ficha de cinco bloques (DOMINIO, PROBLEMA, ACTORES, CAPACIDADES, FUERA DE ALCANCE) con 3 a 5 capacidades en la forma verbo mas objeto de negocio, 2 a 3 actores con lo que espera cada uno, los sistemas externos dentro del bloque ACTORES, y lo que el sistema no hara este semestre; verifique que ninguna capacidad nombre tecnologia.</w:t>
       </w:r>
     </w:p>
     <w:p>
@@ -411,7 +411,7 @@
           <w:color w:val="2B2B2B"/>
           <w:sz w:val="22"/>
         </w:rPr>
-        <w:t>Paso 3: dibuje primero el boceto del C4 Context en Excalidraw o draw.io, que es donde se piensa el modelo, y despues pidale a una IA que lo traduzca a Mermaid («convierte este diagrama a Mermaid usando C4Context»); pegue ese codigo en la pregunta de tipo diagrama de ExamLab y verifique que renderice ahi mismo, con exactamente 1 System para CloudLite, 2 Person, 2 System_Ext y 5 relaciones etiquetadas con verbo de negocio y protocolo, verificando en el diagrama ya renderizado que no aparezca ninguna caja interna (ni base de datos ni API ni worker, eso es Clase 4) y que cada flecha se lea en voz alta como una frase completa.</w:t>
+        <w:t>Paso 3: dibuje primero el boceto del C4 Context en Excalidraw o draw.io, que es donde se piensa el modelo, y despues pidale a una IA que lo traduzca a Mermaid («convierta este diagrama a Mermaid usando C4Context»); peguelo en la pregunta 3 y verifique en el diagrama ya renderizado que el sistema sea UNA sola caja, que no aparezca ninguna caja interna (eso es la pregunta 9) y que cada flecha lleve verbo y protocolo.</w:t>
       </w:r>
     </w:p>
     <w:p>
@@ -426,37 +426,7 @@
           <w:color w:val="2B2B2B"/>
           <w:sz w:val="22"/>
         </w:rPr>
-        <w:t>Paso 4: resuelva la tabla comparativa nube frente a on-premise en la pregunta 4, con los 4 criterios en este orden (inversion inicial, tiempo hasta la primera demo, quien opera el sistema operativo y los respaldos, y que pasa el dia del pico de su dominio) y maximo 2 lineas por celda, verificando que cada celda hable de SU dominio y no de teoria general; la estructura es la que se proyecto en clase, resuelta sobre AgendaU.</w:t>
-      </w:r>
-    </w:p>
-    <w:p>
-      <w:pPr>
-        <w:pStyle w:val="ListBullet"/>
-        <w:spacing w:after="40"/>
-      </w:pPr>
-      <w:r>
-        <w:rPr>
-          <w:rFonts w:ascii="Calibri" w:hAnsi="Calibri" w:eastAsia="Calibri"/>
-          <w:b w:val="0"/>
-          <w:color w:val="2B2B2B"/>
-          <w:sz w:val="22"/>
-        </w:rPr>
-        <w:t>Paso 5: cierre esa misma pregunta 4 con el veredicto de 2 frases: (a) que opcion elige para su CloudLite y (b) que riesgo concreto asume al elegirla, verificando que el riesgo este nombrado y no solo insinuado (por ejemplo dependencia del proveedor). Hoy se decide unicamente nube u on-premise: el modelo de servicio (IaaS, PaaS o SaaS) se decide en la Clase 2, y este veredicto es la entrada del ADR-001 de esa clase.</w:t>
-      </w:r>
-    </w:p>
-    <w:p>
-      <w:pPr>
-        <w:pStyle w:val="ListBullet"/>
-        <w:spacing w:after="40"/>
-      </w:pPr>
-      <w:r>
-        <w:rPr>
-          <w:rFonts w:ascii="Calibri" w:hAnsi="Calibri" w:eastAsia="Calibri"/>
-          <w:b w:val="0"/>
-          <w:color w:val="2B2B2B"/>
-          <w:sz w:val="22"/>
-        </w:rPr>
-        <w:t>Paso 6: suba a ExamLab (modulo Talleres) las 5 preguntas resueltas antes del domingo 23:59, verificando antes de enviar que la ficha de la pregunta 1, el diagrama renderizado de la pregunta 2 y el veredicto de la pregunta 4 usen exactamente los mismos nombres de actores y de sistemas externos; si no coinciden, no son el mismo sistema y las Clases 4, 7, 11 y 15 reutilizan esos nombres.</w:t>
+        <w:t>Paso 4: antes de cerrar la sesion, revise que los nombres de actores y de sistemas externos sean EXACTAMENTE los mismos en la ficha y en el diagrama; si no coinciden, no son el mismo sistema, y las preguntas 9 a 11 de esta actividad reutilizan esos nombres. Las preguntas 4 a 11 se resuelven en las Clases 2, 3 y 4: la actividad se entrega completa al cierre del Corte 1, no hoy.</w:t>
       </w:r>
     </w:p>
     <w:p>
@@ -651,6 +621,96 @@
           <w:color w:val="2B2B2B"/>
           <w:sz w:val="21"/>
         </w:rPr>
+        <w:t>¿Esta actividad se entrega hoy?</w:t>
+      </w:r>
+    </w:p>
+    <w:p>
+      <w:pPr>
+        <w:spacing w:after="120" w:before="0"/>
+        <w:jc w:val="left"/>
+      </w:pPr>
+      <w:r>
+        <w:rPr>
+          <w:rFonts w:ascii="Calibri" w:hAnsi="Calibri" w:eastAsia="Calibri"/>
+          <w:b w:val="0"/>
+          <w:color w:val="2B2B2B"/>
+          <w:sz w:val="21"/>
+        </w:rPr>
+        <w:t>No. Es UNA sola actividad para las Clases 1 a 4, con 11 preguntas. Hoy resuelves las preguntas 1, 2 y 3; las demás se resuelven en las clases siguientes y la entrega completa cierra al final del Corte 1. Puedes guardar y volver.</w:t>
+      </w:r>
+    </w:p>
+    <w:p>
+      <w:pPr>
+        <w:spacing w:after="40" w:before="0"/>
+        <w:jc w:val="left"/>
+      </w:pPr>
+      <w:r>
+        <w:rPr>
+          <w:rFonts w:ascii="Calibri" w:hAnsi="Calibri" w:eastAsia="Calibri"/>
+          <w:b/>
+          <w:color w:val="2B2B2B"/>
+          <w:sz w:val="21"/>
+        </w:rPr>
+        <w:t>¿Qué hace que mi dominio sea «concreto» y no genérico?</w:t>
+      </w:r>
+    </w:p>
+    <w:p>
+      <w:pPr>
+        <w:spacing w:after="120" w:before="0"/>
+        <w:jc w:val="left"/>
+      </w:pPr>
+      <w:r>
+        <w:rPr>
+          <w:rFonts w:ascii="Calibri" w:hAnsi="Calibri" w:eastAsia="Calibri"/>
+          <w:b w:val="0"/>
+          <w:color w:val="2B2B2B"/>
+          <w:sz w:val="21"/>
+        </w:rPr>
+        <w:t>Que el problema nombre a quién lo sufre con un rol («el auxiliar de biblioteca») y cómo se mide con una cifra («38 libros devueltos tarde el semestre pasado»). Si tu enunciado sirve igual para cualquier otro sistema, todavía es genérico.</w:t>
+      </w:r>
+    </w:p>
+    <w:p>
+      <w:pPr>
+        <w:spacing w:after="40" w:before="0"/>
+        <w:jc w:val="left"/>
+      </w:pPr>
+      <w:r>
+        <w:rPr>
+          <w:rFonts w:ascii="Calibri" w:hAnsi="Calibri" w:eastAsia="Calibri"/>
+          <w:b/>
+          <w:color w:val="2B2B2B"/>
+          <w:sz w:val="21"/>
+        </w:rPr>
+        <w:t>¿Los sistemas externos van en un bloque aparte de la ficha?</w:t>
+      </w:r>
+    </w:p>
+    <w:p>
+      <w:pPr>
+        <w:spacing w:after="120" w:before="0"/>
+        <w:jc w:val="left"/>
+      </w:pPr>
+      <w:r>
+        <w:rPr>
+          <w:rFonts w:ascii="Calibri" w:hAnsi="Calibri" w:eastAsia="Calibri"/>
+          <w:b w:val="0"/>
+          <w:color w:val="2B2B2B"/>
+          <w:sz w:val="21"/>
+        </w:rPr>
+        <w:t>No. La ficha son cinco bloques y los sistemas externos van DENTRO de ACTORES. Escríbelos ahí antes de dibujar: son los mismos que van a aparecer como `System_Ext` en el diagrama de la pregunta 3.</w:t>
+      </w:r>
+    </w:p>
+    <w:p>
+      <w:pPr>
+        <w:spacing w:after="40" w:before="0"/>
+        <w:jc w:val="left"/>
+      </w:pPr>
+      <w:r>
+        <w:rPr>
+          <w:rFonts w:ascii="Calibri" w:hAnsi="Calibri" w:eastAsia="Calibri"/>
+          <w:b/>
+          <w:color w:val="2B2B2B"/>
+          <w:sz w:val="21"/>
+        </w:rPr>
         <w:t>¿Tengo que escribir el diagrama a mano en Mermaid?</w:t>
       </w:r>
     </w:p>
@@ -696,7 +756,7 @@
           <w:color w:val="2B2B2B"/>
           <w:sz w:val="21"/>
         </w:rPr>
-        <w:t>Porque hoy entregas el nivel Context, donde el sistema es una sola caja negra. La base de datos y la API aparecen en el nivel Container, que es el entregable de la Clase 4.</w:t>
+        <w:t>Porque hoy entregas el nivel Context, donde el sistema es una sola caja negra. La base de datos y la API aparecen en el nivel Container, que es la pregunta 9 de esta misma actividad. Si las dibujas aquí, esa pregunta se queda sin nada nuevo.</w:t>
       </w:r>
     </w:p>
     <w:p>
@@ -741,66 +801,6 @@
           <w:color w:val="2B2B2B"/>
           <w:sz w:val="21"/>
         </w:rPr>
-        <w:t>¿La respuesta correcta siempre es «nube»?</w:t>
-      </w:r>
-    </w:p>
-    <w:p>
-      <w:pPr>
-        <w:spacing w:after="120" w:before="0"/>
-        <w:jc w:val="left"/>
-      </w:pPr>
-      <w:r>
-        <w:rPr>
-          <w:rFonts w:ascii="Calibri" w:hAnsi="Calibri" w:eastAsia="Calibri"/>
-          <w:b w:val="0"/>
-          <w:color w:val="2B2B2B"/>
-          <w:sz w:val="21"/>
-        </w:rPr>
-        <w:t>No se califica la elección: se califican los 4 criterios aplicados a TU dominio y el riesgo que declaras asumir. Un veredicto por on-premise bien sustentado vale lo mismo. Lo que no vale es un veredicto sin riesgo.</w:t>
-      </w:r>
-    </w:p>
-    <w:p>
-      <w:pPr>
-        <w:spacing w:after="40" w:before="0"/>
-        <w:jc w:val="left"/>
-      </w:pPr>
-      <w:r>
-        <w:rPr>
-          <w:rFonts w:ascii="Calibri" w:hAnsi="Calibri" w:eastAsia="Calibri"/>
-          <w:b/>
-          <w:color w:val="2B2B2B"/>
-          <w:sz w:val="21"/>
-        </w:rPr>
-        <w:t>¿Tengo que abrir una cuenta en AWS o Azure?</w:t>
-      </w:r>
-    </w:p>
-    <w:p>
-      <w:pPr>
-        <w:spacing w:after="120" w:before="0"/>
-        <w:jc w:val="left"/>
-      </w:pPr>
-      <w:r>
-        <w:rPr>
-          <w:rFonts w:ascii="Calibri" w:hAnsi="Calibri" w:eastAsia="Calibri"/>
-          <w:b w:val="0"/>
-          <w:color w:val="2B2B2B"/>
-          <w:sz w:val="21"/>
-        </w:rPr>
-        <w:t>No, y ninguna actividad del curso lo va a pedir. Nada de tarjeta de crédito en todo el semestre.</w:t>
-      </w:r>
-    </w:p>
-    <w:p>
-      <w:pPr>
-        <w:spacing w:after="40" w:before="0"/>
-        <w:jc w:val="left"/>
-      </w:pPr>
-      <w:r>
-        <w:rPr>
-          <w:rFonts w:ascii="Calibri" w:hAnsi="Calibri" w:eastAsia="Calibri"/>
-          <w:b/>
-          <w:color w:val="2B2B2B"/>
-          <w:sz w:val="21"/>
-        </w:rPr>
         <w:t>¿Puedo cambiar de dominio más adelante?</w:t>
       </w:r>
     </w:p>
@@ -816,7 +816,7 @@
           <w:color w:val="2B2B2B"/>
           <w:sz w:val="21"/>
         </w:rPr>
-        <w:t>No. El dominio se cierra hoy y las Clases 4, 7, 11 y 15 reutilizan estos mismos nombres. Si te queda grande, recorta el bloque «fuera de alcance».</w:t>
+        <w:t>No. El dominio se cierra hoy y las preguntas 4 a 11 de esta actividad, más las Clases 7, 11 y 15, reutilizan estos mismos nombres. Si te queda grande, recorta el bloque «fuera de alcance».</w:t>
       </w:r>
     </w:p>
     <w:p>
@@ -892,7 +892,7 @@
           <w:color w:val="2B2B2B"/>
           <w:sz w:val="22"/>
         </w:rPr>
-        <w:t>El estudiante sale con el dominio de CloudLite cerrado en una ficha de 6 bloques y con el diagrama C4 Context renderizado dentro de ExamLab, que es la semilla de todos los diagramas del semestre.</w:t>
+        <w:t>Las preguntas 1 a 3 de la actividad del Corte 1, que es una sola para las Clases 1 a 4. El estudiante sale con el dominio de CloudLite cerrado en una ficha de cinco bloques y con el diagrama C4 Context renderizado dentro de ExamLab, que es la semilla de todos los diagramas del semestre.</w:t>
       </w:r>
     </w:p>
     <w:p>
@@ -907,7 +907,7 @@
           <w:color w:val="2B2B2B"/>
           <w:sz w:val="22"/>
         </w:rPr>
-        <w:t>El taller se resuelve y se entrega en ExamLab (https://uniaj.examlab.workers.dev/), en el modulo Talleres. Son 5 preguntas y suman 100 puntos. Lo que sigue es lo que vas a encontrar en cada una, para que sepas de antemano en que forma se responde:</w:t>
+        <w:t>El taller se resuelve y se entrega en ExamLab (https://uniaj.examlab.workers.dev/), en el modulo Talleres. Son 3 preguntas y suman 24 puntos. Lo que sigue es lo que vas a encontrar en cada una, para que sepas de antemano en que forma se responde:</w:t>
       </w:r>
     </w:p>
     <w:p>
@@ -918,7 +918,7 @@
           <w:color w:val="2B2B2B"/>
           <w:sz w:val="22"/>
         </w:rPr>
-        <w:t>Pregunta 1 - Respuesta escrita (20 pts):</w:t>
+        <w:t>Pregunta 1 - Respuesta escrita (6.25 pts):</w:t>
       </w:r>
       <w:r>
         <w:rPr>
@@ -927,7 +927,7 @@
           <w:color w:val="2B2B2B"/>
           <w:sz w:val="22"/>
         </w:rPr>
-        <w:t xml:space="preserve"> Ficha del PI CloudLite App.</w:t>
+        <w:t xml:space="preserve"> Dominio y problema de CloudLite App.</w:t>
       </w:r>
     </w:p>
     <w:p>
@@ -953,7 +953,7 @@
           <w:color w:val="2B2B2B"/>
           <w:sz w:val="22"/>
         </w:rPr>
-        <w:t>Pregunta 2 - Diagrama (Mermaid) (35 pts):</w:t>
+        <w:t>Pregunta 2 - Respuesta escrita (8.75 pts):</w:t>
       </w:r>
       <w:r>
         <w:rPr>
@@ -962,77 +962,7 @@
           <w:color w:val="2B2B2B"/>
           <w:sz w:val="22"/>
         </w:rPr>
-        <w:t xml:space="preserve"> C4 Context de CloudLite App.</w:t>
-      </w:r>
-    </w:p>
-    <w:p>
-      <w:pPr>
-        <w:pStyle w:val="ListBullet"/>
-        <w:spacing w:after="40"/>
-      </w:pPr>
-      <w:r>
-        <w:rPr>
-          <w:rFonts w:ascii="Calibri" w:hAnsi="Calibri" w:eastAsia="Calibri"/>
-          <w:b w:val="0"/>
-          <w:color w:val="2B2B2B"/>
-          <w:sz w:val="22"/>
-        </w:rPr>
-        <w:t>El diagrama se escribe como texto en sintaxis Mermaid y la plataforma lo dibuja al instante: no se sube una imagen. Puedes disenarlo primero a mano en Excalidraw o draw.io y pedirle a una IA que lo traduzca a Mermaid (ver «Del boceto al codigo Mermaid» mas abajo).</w:t>
-      </w:r>
-    </w:p>
-    <w:p>
-      <w:r>
-        <w:rPr>
-          <w:rFonts w:ascii="Calibri" w:hAnsi="Calibri" w:eastAsia="Calibri"/>
-          <w:b/>
-          <w:color w:val="2B2B2B"/>
-          <w:sz w:val="22"/>
-        </w:rPr>
-        <w:t>Pregunta 3 - Seleccion multiple (15 pts):</w:t>
-      </w:r>
-      <w:r>
-        <w:rPr>
-          <w:rFonts w:ascii="Calibri" w:hAnsi="Calibri" w:eastAsia="Calibri"/>
-          <w:b w:val="0"/>
-          <w:color w:val="2B2B2B"/>
-          <w:sz w:val="22"/>
-        </w:rPr>
-        <w:t xml:space="preserve"> Nube y on-premise: que es cierto.</w:t>
-      </w:r>
-    </w:p>
-    <w:p>
-      <w:pPr>
-        <w:pStyle w:val="ListBullet"/>
-        <w:spacing w:after="40"/>
-      </w:pPr>
-      <w:r>
-        <w:rPr>
-          <w:rFonts w:ascii="Calibri" w:hAnsi="Calibri" w:eastAsia="Calibri"/>
-          <w:b w:val="0"/>
-          <w:color w:val="2B2B2B"/>
-          <w:sz w:val="22"/>
-        </w:rPr>
-        <w:t>Varias opciones y mas de una correcta; marque todas las que apliquen.</w:t>
-      </w:r>
-    </w:p>
-    <w:p>
-      <w:r>
-        <w:rPr>
-          <w:rFonts w:ascii="Calibri" w:hAnsi="Calibri" w:eastAsia="Calibri"/>
-          <w:b/>
-          <w:color w:val="2B2B2B"/>
-          <w:sz w:val="22"/>
-        </w:rPr>
-        <w:t>Pregunta 4 - Respuesta escrita (20 pts):</w:t>
-      </w:r>
-      <w:r>
-        <w:rPr>
-          <w:rFonts w:ascii="Calibri" w:hAnsi="Calibri" w:eastAsia="Calibri"/>
-          <w:b w:val="0"/>
-          <w:color w:val="2B2B2B"/>
-          <w:sz w:val="22"/>
-        </w:rPr>
-        <w:t xml:space="preserve"> Nube u on-premise para CloudLite.</w:t>
+        <w:t xml:space="preserve"> Ficha del dominio.</w:t>
       </w:r>
     </w:p>
     <w:p>
@@ -1058,7 +988,7 @@
           <w:color w:val="2B2B2B"/>
           <w:sz w:val="22"/>
         </w:rPr>
-        <w:t>Pregunta 5 - Seleccion unica (10 pts):</w:t>
+        <w:t>Pregunta 3 - Diagrama (Mermaid) (10.0 pts):</w:t>
       </w:r>
       <w:r>
         <w:rPr>
@@ -1067,7 +997,7 @@
           <w:color w:val="2B2B2B"/>
           <w:sz w:val="22"/>
         </w:rPr>
-        <w:t xml:space="preserve"> Nivel del modelo C4.</w:t>
+        <w:t xml:space="preserve"> C4 Context de CloudLite App.</w:t>
       </w:r>
     </w:p>
     <w:p>
@@ -1082,7 +1012,7 @@
           <w:color w:val="2B2B2B"/>
           <w:sz w:val="22"/>
         </w:rPr>
-        <w:t>Varias opciones, una sola correcta.</w:t>
+        <w:t>El diagrama se escribe como texto en sintaxis Mermaid y la plataforma lo dibuja al instante: no se sube una imagen. Puedes disenarlo primero a mano en Excalidraw o draw.io y pedirle a una IA que lo traduzca a Mermaid (ver «Del boceto al codigo Mermaid» mas abajo).</w:t>
       </w:r>
     </w:p>
     <w:p>

</xml_diff>

<commit_message>
Actividad unica del Corte 1 en ARQ: 15 preguntas para las Clases 1-4
Co-Authored-By: Claude Opus 5 <noreply@anthropic.com>
</commit_message>
<xml_diff>
--- a/Arquitectura de Sistemas Computacionales/Clases/Clase 1 - Introduccion a arquitecturas cloud/Taller Clase 1 — Ficha y boceto CloudLite App.docx
+++ b/Arquitectura de Sistemas Computacionales/Clases/Clase 1 - Introduccion a arquitecturas cloud/Taller Clase 1 — Ficha y boceto CloudLite App.docx
@@ -411,7 +411,7 @@
           <w:color w:val="2B2B2B"/>
           <w:sz w:val="22"/>
         </w:rPr>
-        <w:t>Paso 3: dibuje primero el boceto del C4 Context en Excalidraw o draw.io, que es donde se piensa el modelo, y despues pidale a una IA que lo traduzca a Mermaid («convierta este diagrama a Mermaid usando C4Context»); peguelo en la pregunta 3 y verifique en el diagrama ya renderizado que el sistema sea UNA sola caja, que no aparezca ninguna caja interna (eso es la pregunta 9) y que cada flecha lleve verbo y protocolo.</w:t>
+        <w:t>Paso 3: dibuje primero el boceto del C4 Context en Excalidraw o draw.io, que es donde se piensa el modelo, y despues pidale a una IA que lo traduzca a Mermaid («convierta este diagrama a Mermaid usando C4Context»); peguelo en la pregunta 3 y verifique en el diagrama ya renderizado que el sistema sea UNA sola caja, que no aparezca ninguna caja interna (eso es la pregunta 13) y que cada flecha lleve verbo y protocolo.</w:t>
       </w:r>
     </w:p>
     <w:p>
@@ -426,7 +426,7 @@
           <w:color w:val="2B2B2B"/>
           <w:sz w:val="22"/>
         </w:rPr>
-        <w:t>Paso 4: antes de cerrar la sesion, revise que los nombres de actores y de sistemas externos sean EXACTAMENTE los mismos en la ficha y en el diagrama; si no coinciden, no son el mismo sistema, y las preguntas 9 a 11 de esta actividad reutilizan esos nombres. Las preguntas 4 a 11 se resuelven en las Clases 2, 3 y 4: la actividad se entrega completa al cierre del Corte 1, no hoy.</w:t>
+        <w:t>Paso 4: elija en la pregunta 4 dos atributos de calidad de los cuatro del curso, escriba por que pesan en SU dominio y como los mediria con un numero y una unidad, y cierre diciendo cual sacrificaria y que gana a cambio; revise ademas que los nombres de actores y de sistemas externos sean EXACTAMENTE los mismos en la ficha y en el diagrama, porque las preguntas 12 a 15 los reutilizan. Las preguntas 5 a 15 se resuelven en las Clases 2, 3 y 4: la actividad se entrega completa al cierre del Corte 1, no hoy.</w:t>
       </w:r>
     </w:p>
     <w:p>
@@ -636,7 +636,7 @@
           <w:color w:val="2B2B2B"/>
           <w:sz w:val="21"/>
         </w:rPr>
-        <w:t>No. Es UNA sola actividad para las Clases 1 a 4, con 11 preguntas. Hoy resuelves las preguntas 1, 2 y 3; las demás se resuelven en las clases siguientes y la entrega completa cierra al final del Corte 1. Puedes guardar y volver.</w:t>
+        <w:t>No. Es UNA sola actividad para las Clases 1 a 4, con 15 preguntas. Hoy resuelves las preguntas 1 a 4; las demás se resuelven en las clases siguientes y la entrega completa cierra al final del Corte 1. Puedes guardar y volver.</w:t>
       </w:r>
     </w:p>
     <w:p>
@@ -756,7 +756,7 @@
           <w:color w:val="2B2B2B"/>
           <w:sz w:val="21"/>
         </w:rPr>
-        <w:t>Porque hoy entregas el nivel Context, donde el sistema es una sola caja negra. La base de datos y la API aparecen en el nivel Container, que es la pregunta 9 de esta misma actividad. Si las dibujas aquí, esa pregunta se queda sin nada nuevo.</w:t>
+        <w:t>Porque hoy entregas el nivel Context, donde el sistema es una sola caja negra. La base de datos y la API aparecen en el nivel Container, que es la pregunta 13 de esta misma actividad. Si las dibujas aquí, esa pregunta se queda sin nada nuevo.</w:t>
       </w:r>
     </w:p>
     <w:p>
@@ -801,6 +801,36 @@
           <w:color w:val="2B2B2B"/>
           <w:sz w:val="21"/>
         </w:rPr>
+        <w:t>En atributos de calidad, ¿puedo decir que los cuatro son importantes?</w:t>
+      </w:r>
+    </w:p>
+    <w:p>
+      <w:pPr>
+        <w:spacing w:after="120" w:before="0"/>
+        <w:jc w:val="left"/>
+      </w:pPr>
+      <w:r>
+        <w:rPr>
+          <w:rFonts w:ascii="Calibri" w:hAnsi="Calibri" w:eastAsia="Calibri"/>
+          <w:b w:val="0"/>
+          <w:color w:val="2B2B2B"/>
+          <w:sz w:val="21"/>
+        </w:rPr>
+        <w:t>No. La pregunta evalúa exactamente lo contrario: que elijas dos, los midas con un número y digas cuál sacrificas. Más disponibilidad exige redundancia y la redundancia cuesta; arquitectura es elegir qué se sacrifica.</w:t>
+      </w:r>
+    </w:p>
+    <w:p>
+      <w:pPr>
+        <w:spacing w:after="40" w:before="0"/>
+        <w:jc w:val="left"/>
+      </w:pPr>
+      <w:r>
+        <w:rPr>
+          <w:rFonts w:ascii="Calibri" w:hAnsi="Calibri" w:eastAsia="Calibri"/>
+          <w:b/>
+          <w:color w:val="2B2B2B"/>
+          <w:sz w:val="21"/>
+        </w:rPr>
         <w:t>¿Puedo cambiar de dominio más adelante?</w:t>
       </w:r>
     </w:p>
@@ -816,7 +846,7 @@
           <w:color w:val="2B2B2B"/>
           <w:sz w:val="21"/>
         </w:rPr>
-        <w:t>No. El dominio se cierra hoy y las preguntas 4 a 11 de esta actividad, más las Clases 7, 11 y 15, reutilizan estos mismos nombres. Si te queda grande, recorta el bloque «fuera de alcance».</w:t>
+        <w:t>No. El dominio se cierra hoy y las preguntas 5 a 15 de esta actividad, más las Clases 7, 11 y 15, reutilizan estos mismos nombres. Si te queda grande, recorta el bloque «fuera de alcance».</w:t>
       </w:r>
     </w:p>
     <w:p>
@@ -892,7 +922,7 @@
           <w:color w:val="2B2B2B"/>
           <w:sz w:val="22"/>
         </w:rPr>
-        <w:t>Las preguntas 1 a 3 de la actividad del Corte 1, que es una sola para las Clases 1 a 4. El estudiante sale con el dominio de CloudLite cerrado en una ficha de cinco bloques y con el diagrama C4 Context renderizado dentro de ExamLab, que es la semilla de todos los diagramas del semestre.</w:t>
+        <w:t>Las preguntas 1 a 4 de la actividad del Corte 1, que es una sola para las Clases 1 a 4. El estudiante sale con el dominio de CloudLite cerrado en una ficha de cinco bloques y con el diagrama C4 Context renderizado dentro de ExamLab, que es la semilla de todos los diagramas del semestre.</w:t>
       </w:r>
     </w:p>
     <w:p>
@@ -907,7 +937,7 @@
           <w:color w:val="2B2B2B"/>
           <w:sz w:val="22"/>
         </w:rPr>
-        <w:t>El taller se resuelve y se entrega en ExamLab (https://uniaj.examlab.workers.dev/), en el modulo Talleres. Son 3 preguntas y suman 24 puntos. Lo que sigue es lo que vas a encontrar en cada una, para que sepas de antemano en que forma se responde:</w:t>
+        <w:t>El taller se resuelve y se entrega en ExamLab (https://uniaj.examlab.workers.dev/), en el modulo Talleres. Son 4 preguntas y suman 25 puntos. Lo que sigue es lo que vas a encontrar en cada una, para que sepas de antemano en que forma se responde:</w:t>
       </w:r>
     </w:p>
     <w:p>
@@ -918,7 +948,7 @@
           <w:color w:val="2B2B2B"/>
           <w:sz w:val="22"/>
         </w:rPr>
-        <w:t>Pregunta 1 - Respuesta escrita (6.25 pts):</w:t>
+        <w:t>Pregunta 1 - Respuesta escrita (5.0 pts):</w:t>
       </w:r>
       <w:r>
         <w:rPr>
@@ -953,7 +983,7 @@
           <w:color w:val="2B2B2B"/>
           <w:sz w:val="22"/>
         </w:rPr>
-        <w:t>Pregunta 2 - Respuesta escrita (8.75 pts):</w:t>
+        <w:t>Pregunta 2 - Respuesta escrita (7.0 pts):</w:t>
       </w:r>
       <w:r>
         <w:rPr>
@@ -988,7 +1018,7 @@
           <w:color w:val="2B2B2B"/>
           <w:sz w:val="22"/>
         </w:rPr>
-        <w:t>Pregunta 3 - Diagrama (Mermaid) (10.0 pts):</w:t>
+        <w:t>Pregunta 3 - Diagrama (Mermaid) (8.0 pts):</w:t>
       </w:r>
       <w:r>
         <w:rPr>
@@ -1013,6 +1043,41 @@
           <w:sz w:val="22"/>
         </w:rPr>
         <w:t>El diagrama se escribe como texto en sintaxis Mermaid y la plataforma lo dibuja al instante: no se sube una imagen. Puedes disenarlo primero a mano en Excalidraw o draw.io y pedirle a una IA que lo traduzca a Mermaid (ver «Del boceto al codigo Mermaid» mas abajo).</w:t>
+      </w:r>
+    </w:p>
+    <w:p>
+      <w:r>
+        <w:rPr>
+          <w:rFonts w:ascii="Calibri" w:hAnsi="Calibri" w:eastAsia="Calibri"/>
+          <w:b/>
+          <w:color w:val="2B2B2B"/>
+          <w:sz w:val="22"/>
+        </w:rPr>
+        <w:t>Pregunta 4 - Respuesta escrita (5.0 pts):</w:t>
+      </w:r>
+      <w:r>
+        <w:rPr>
+          <w:rFonts w:ascii="Calibri" w:hAnsi="Calibri" w:eastAsia="Calibri"/>
+          <w:b w:val="0"/>
+          <w:color w:val="2B2B2B"/>
+          <w:sz w:val="22"/>
+        </w:rPr>
+        <w:t xml:space="preserve"> Atributos de calidad de su CloudLite.</w:t>
+      </w:r>
+    </w:p>
+    <w:p>
+      <w:pPr>
+        <w:pStyle w:val="ListBullet"/>
+        <w:spacing w:after="40"/>
+      </w:pPr>
+      <w:r>
+        <w:rPr>
+          <w:rFonts w:ascii="Calibri" w:hAnsi="Calibri" w:eastAsia="Calibri"/>
+          <w:b w:val="0"/>
+          <w:color w:val="2B2B2B"/>
+          <w:sz w:val="22"/>
+        </w:rPr>
+        <w:t>Un cuadro de texto. Se escribe directamente en la plataforma; no se sube archivo.</w:t>
       </w:r>
     </w:p>
     <w:p>

</xml_diff>

<commit_message>
ARQ Clase 2: ADR unificado en 6 secciones, plantilla del entregable en el taller y demo con slide citada
</commit_message>
<xml_diff>
--- a/Arquitectura de Sistemas Computacionales/Clases/Clase 1 - Introduccion a arquitecturas cloud/Taller Clase 1 — Ficha y boceto CloudLite App.docx
+++ b/Arquitectura de Sistemas Computacionales/Clases/Clase 1 - Introduccion a arquitecturas cloud/Taller Clase 1 — Ficha y boceto CloudLite App.docx
@@ -696,7 +696,7 @@
           <w:color w:val="2B2B2B"/>
           <w:sz w:val="21"/>
         </w:rPr>
-        <w:t>No. La ficha son cinco bloques y los sistemas externos van DENTRO de ACTORES. Escríbelos ahí antes de dibujar: son los mismos que van a aparecer como `System_Ext` en el diagrama de la pregunta 3.</w:t>
+        <w:t>No. La ficha son cinco bloques y los sistemas externos van DENTRO de ACTORES. Escríbelos ahí antes de dibujar: son los mismos que van a aparecer como «System_Ext» en el diagrama de la pregunta 3.</w:t>
       </w:r>
     </w:p>
     <w:p>
@@ -907,7 +907,7 @@
           <w:color w:val="095292"/>
           <w:sz w:val="24"/>
         </w:rPr>
-        <w:t>11. Que vas a resolver en ExamLab</w:t>
+        <w:t>11. Qué vas a resolver en ExamLab</w:t>
       </w:r>
     </w:p>
     <w:p>
@@ -1107,7 +1107,7 @@
           <w:color w:val="2B2B2B"/>
           <w:sz w:val="22"/>
         </w:rPr>
-        <w:t>La pregunta de diagrama NO recibe imagenes: se responde con codigo Mermaid (`C4Context`) que la plataforma dibuja al instante. No tienes que escribirlo de memoria; el camino corto es este:</w:t>
+        <w:t>La pregunta de diagrama NO recibe imagenes: se responde con codigo Mermaid («C4Context») que la plataforma dibuja al instante. No tienes que escribirlo de memoria; el camino corto es este:</w:t>
       </w:r>
     </w:p>
     <w:p>
@@ -1147,7 +1147,7 @@
           <w:color w:val="2B2B2B"/>
           <w:sz w:val="22"/>
         </w:rPr>
-        <w:t xml:space="preserve"> Copia o describe tu boceto a una IA y pidele el codigo Mermaid: «convierte este diagrama a Mermaid usando `C4Context`». Revisa el resultado: la IA acierta la sintaxis, no tu modelo.</w:t>
+        <w:t xml:space="preserve"> Copia o describe tu boceto a una IA y pidele el codigo Mermaid: «convierte este diagrama a Mermaid usando «C4Context»». Revisa el resultado: la IA acierta la sintaxis, no tu modelo.</w:t>
       </w:r>
     </w:p>
     <w:p>

</xml_diff>